<commit_message>
Fix reference URLs to be real clickable hyperlinks in Unit 1 assignment
Previous version had plain-text URLs in the reference list; APA 7 and
the repo's own writing rules require actual clickable hyperlinks in
submitted .docx files.
</commit_message>
<xml_diff>
--- a/Term_02/BUS 1102-01 Basic Accounting - AY2027-T1/Assignments/Unit1_Assignment.docx
+++ b/Term_02/BUS 1102-01 Basic Accounting - AY2027-T1/Assignments/Unit1_Assignment.docx
@@ -1259,6 +1259,7 @@
       <w:r>
         <w:rPr>
           <w:rFonts w:ascii="Times New Roman" w:hAnsi="Times New Roman"/>
+          <w:i w:val="0"/>
           <w:sz w:val="24"/>
         </w:rPr>
         <w:t xml:space="preserve">Franklin, M., Graybeal, P., Cooper, D., Bean, L., Burt, I., Carr, S., Collins, D. T., Coram, S., Creech, K., Czyzewski, A., Gauci, M., Greenman, C., Haselkorn, M., Irujo, C., Johnson, C., Khanlarian, C., Lukshaitis, T., Luna, D., Nantz, B., … Woolley, D. (2022). </w:t>
@@ -1274,10 +1275,22 @@
       <w:r>
         <w:rPr>
           <w:rFonts w:ascii="Times New Roman" w:hAnsi="Times New Roman"/>
+          <w:i w:val="0"/>
           <w:sz w:val="24"/>
         </w:rPr>
-        <w:t>. OpenStax. Licensed under CC 4.0. https://openstax.org/details/books/principles-financial-accounting</w:t>
+        <w:t xml:space="preserve">. OpenStax. Licensed under CC 4.0. </w:t>
       </w:r>
+      <w:hyperlink r:id="rId9">
+        <w:r>
+          <w:rPr>
+            <w:rFonts w:ascii="Times New Roman" w:hAnsi="Times New Roman"/>
+            <w:sz w:val="24"/>
+            <w:color w:val="0563C1"/>
+            <w:u w:val="single"/>
+          </w:rPr>
+          <w:t>https://openstax.org/details/books/principles-financial-accounting</w:t>
+        </w:r>
+      </w:hyperlink>
     </w:p>
     <w:p>
       <w:pPr>
@@ -1287,6 +1300,7 @@
       <w:r>
         <w:rPr>
           <w:rFonts w:ascii="Times New Roman" w:hAnsi="Times New Roman"/>
+          <w:i w:val="0"/>
           <w:sz w:val="24"/>
         </w:rPr>
         <w:t xml:space="preserve">Rhinehart, C. (2024, November 7). </w:t>
@@ -1302,10 +1316,22 @@
       <w:r>
         <w:rPr>
           <w:rFonts w:ascii="Times New Roman" w:hAnsi="Times New Roman"/>
+          <w:i w:val="0"/>
           <w:sz w:val="24"/>
         </w:rPr>
-        <w:t xml:space="preserve"> Investopedia. https://www.investopedia.com/articles/analyst/03/122203.asp</w:t>
+        <w:t xml:space="preserve"> Investopedia. </w:t>
       </w:r>
+      <w:hyperlink r:id="rId10">
+        <w:r>
+          <w:rPr>
+            <w:rFonts w:ascii="Times New Roman" w:hAnsi="Times New Roman"/>
+            <w:sz w:val="24"/>
+            <w:color w:val="0563C1"/>
+            <w:u w:val="single"/>
+          </w:rPr>
+          <w:t>https://www.investopedia.com/articles/analyst/03/122203.asp</w:t>
+        </w:r>
+      </w:hyperlink>
     </w:p>
     <w:p>
       <w:pPr>
@@ -1315,6 +1341,7 @@
       <w:r>
         <w:rPr>
           <w:rFonts w:ascii="Times New Roman" w:hAnsi="Times New Roman"/>
+          <w:i w:val="0"/>
           <w:sz w:val="24"/>
         </w:rPr>
         <w:t xml:space="preserve">Segal, T. (2024, December 3). </w:t>
@@ -1330,10 +1357,22 @@
       <w:r>
         <w:rPr>
           <w:rFonts w:ascii="Times New Roman" w:hAnsi="Times New Roman"/>
+          <w:i w:val="0"/>
           <w:sz w:val="24"/>
         </w:rPr>
-        <w:t xml:space="preserve"> Investopedia. https://www.investopedia.com/updates/enron-scandal-summary/</w:t>
+        <w:t xml:space="preserve"> Investopedia. </w:t>
       </w:r>
+      <w:hyperlink r:id="rId11">
+        <w:r>
+          <w:rPr>
+            <w:rFonts w:ascii="Times New Roman" w:hAnsi="Times New Roman"/>
+            <w:sz w:val="24"/>
+            <w:color w:val="0563C1"/>
+            <w:u w:val="single"/>
+          </w:rPr>
+          <w:t>https://www.investopedia.com/updates/enron-scandal-summary/</w:t>
+        </w:r>
+      </w:hyperlink>
     </w:p>
     <w:sectPr>
       <w:pgSz w:w="12240" w:h="15840"/>

</xml_diff>